<commit_message>
cerberus: add stack-aware test-mail and daemon error alerts
Extend test-mail so operators can simulate stack-specific vulnerability alerts with package, version, advisory, vhost, and evidence overrides. This makes remediation messaging testable without waiting for a real finding and keeps the README, changelog, and exported docs aligned with the new workflow.

Add dedicated internal-error notifications for unhandled Cerberus execution failures in scan-once, sync-cve, and daemon mode. These alerts bypass digest grouping, remain deduplicated through the state store, and invite operators to report reproducible bugs on the public GitHub issue tracker.
</commit_message>
<xml_diff>
--- a/docs/Cerberus-README-pandoc.docx
+++ b/docs/Cerberus-README-pandoc.docx
@@ -1072,7 +1072,7 @@
         <w:t xml:space="preserve"> </w:t>
       </w:r>
       <w:r>
-        <w:t xml:space="preserve">can simulate explicit severities and categories.</w:t>
+        <w:t xml:space="preserve">can simulate explicit severities, categories, and stack-specific vulnerability samples.</w:t>
       </w:r>
     </w:p>
     <w:p>
@@ -1211,6 +1211,18 @@
           <w:rStyle w:val="VerbatimChar"/>
         </w:rPr>
         <w:t xml:space="preserve">scan-failure</w:t>
+      </w:r>
+      <w:r>
+        <w:t xml:space="preserve">,</w:t>
+      </w:r>
+      <w:r>
+        <w:t xml:space="preserve"> </w:t>
+      </w:r>
+      <w:r>
+        <w:rPr>
+          <w:rStyle w:val="VerbatimChar"/>
+        </w:rPr>
+        <w:t xml:space="preserve">internal-error</w:t>
       </w:r>
       <w:r>
         <w:t xml:space="preserve">,</w:t>
@@ -1294,7 +1306,64 @@
         <w:rPr>
           <w:rStyle w:val="VerbatimChar"/>
         </w:rPr>
+        <w:t xml:space="preserve">vhost-cve-monitor --config /etc/vhost-cve-monitor/config.yml test-mail --severity HIGH --category internal-error</w:t>
+      </w:r>
+    </w:p>
+    <w:p>
+      <w:pPr>
+        <w:pStyle w:val="Compact"/>
+        <w:numPr>
+          <w:numId w:val="1006"/>
+          <w:ilvl w:val="1"/>
+        </w:numPr>
+      </w:pPr>
+      <w:r>
+        <w:rPr>
+          <w:rStyle w:val="VerbatimChar"/>
+        </w:rPr>
         <w:t xml:space="preserve">vhost-cve-monitor --config /etc/vhost-cve-monitor/config.yml test-mail --severity MEDIUM --category digest</w:t>
+      </w:r>
+    </w:p>
+    <w:p>
+      <w:pPr>
+        <w:pStyle w:val="Compact"/>
+        <w:numPr>
+          <w:numId w:val="1006"/>
+          <w:ilvl w:val="1"/>
+        </w:numPr>
+      </w:pPr>
+      <w:r>
+        <w:rPr>
+          <w:rStyle w:val="VerbatimChar"/>
+        </w:rPr>
+        <w:t xml:space="preserve">vhost-cve-monitor --config /etc/vhost-cve-monitor/config.yml test-mail --category vulnerability --stack nodejs --package lodash --installed-version 4.17.23 --fixed-version "&gt;= 4.17.24" --advisory-id GHSA-35jh-r3h4-6jhm</w:t>
+      </w:r>
+    </w:p>
+    <w:p>
+      <w:pPr>
+        <w:pStyle w:val="Compact"/>
+        <w:numPr>
+          <w:numId w:val="1005"/>
+          <w:ilvl w:val="0"/>
+        </w:numPr>
+      </w:pPr>
+      <w:r>
+        <w:t xml:space="preserve">Unhandled Cerberus execution failures generate a direct</w:t>
+      </w:r>
+      <w:r>
+        <w:t xml:space="preserve"> </w:t>
+      </w:r>
+      <w:r>
+        <w:rPr>
+          <w:rStyle w:val="VerbatimChar"/>
+        </w:rPr>
+        <w:t xml:space="preserve">internal-error</w:t>
+      </w:r>
+      <w:r>
+        <w:t xml:space="preserve"> </w:t>
+      </w:r>
+      <w:r>
+        <w:t xml:space="preserve">mail with a GitHub bug-report hint and are not wrapped into digest mode.</w:t>
       </w:r>
     </w:p>
     <w:p>

</xml_diff>

<commit_message>
cerberus: support authenticated SMTP with STARTTLS and SMTPS
Extend the notification backend so Cerberus can relay mail through authenticated SMTP servers in addition to local sendmail/Postfix handoff. Add support for STARTTLS and implicit TLS (SMTP_SSL), optional SMTP authentication, and password loading from an environment variable to avoid storing relay secrets in YAML.

Update the default configuration example, operator-facing documentation, changelog, and exported office docs to describe the new SMTP settings and relay modes. Add focused tests that cover STARTTLS login, SMTPS delivery, and password lookup through smtp_password_env.
</commit_message>
<xml_diff>
--- a/docs/Cerberus-README-pandoc.docx
+++ b/docs/Cerberus-README-pandoc.docx
@@ -177,7 +177,7 @@
         </w:numPr>
       </w:pPr>
       <w:r>
-        <w:t xml:space="preserve">notify delivers alerts through local sendmail or SMTP.</w:t>
+        <w:t xml:space="preserve">notify delivers alerts through local sendmail, plain SMTP, STARTTLS SMTP, or authenticated SMTPS/SMTP.</w:t>
       </w:r>
     </w:p>
     <w:p>
@@ -1003,7 +1003,61 @@
         </w:numPr>
       </w:pPr>
       <w:r>
-        <w:t xml:space="preserve">Messages are handed off to local sendmail/Postfix.</w:t>
+        <w:t xml:space="preserve">Messages are handed off to local sendmail/Postfix or to a configured SMTP relay.</w:t>
+      </w:r>
+    </w:p>
+    <w:p>
+      <w:pPr>
+        <w:pStyle w:val="Compact"/>
+        <w:numPr>
+          <w:numId w:val="1005"/>
+          <w:ilvl w:val="0"/>
+        </w:numPr>
+      </w:pPr>
+      <w:r>
+        <w:t xml:space="preserve">SMTP mode supports both STARTTLS and implicit TLS, with optional authentication credentials.</w:t>
+      </w:r>
+    </w:p>
+    <w:p>
+      <w:pPr>
+        <w:pStyle w:val="Compact"/>
+        <w:numPr>
+          <w:numId w:val="1005"/>
+          <w:ilvl w:val="0"/>
+        </w:numPr>
+      </w:pPr>
+      <w:r>
+        <w:t xml:space="preserve">Prefer</w:t>
+      </w:r>
+      <w:r>
+        <w:t xml:space="preserve"> </w:t>
+      </w:r>
+      <w:r>
+        <w:rPr>
+          <w:rStyle w:val="VerbatimChar"/>
+        </w:rPr>
+        <w:t xml:space="preserve">smtp_password_env</w:t>
+      </w:r>
+      <w:r>
+        <w:t xml:space="preserve"> </w:t>
+      </w:r>
+      <w:r>
+        <w:t xml:space="preserve">over</w:t>
+      </w:r>
+      <w:r>
+        <w:t xml:space="preserve"> </w:t>
+      </w:r>
+      <w:r>
+        <w:rPr>
+          <w:rStyle w:val="VerbatimChar"/>
+        </w:rPr>
+        <w:t xml:space="preserve">smtp_password</w:t>
+      </w:r>
+      <w:r>
+        <w:t xml:space="preserve"> </w:t>
+      </w:r>
+      <w:r>
+        <w:t xml:space="preserve">when storing relay credentials outside the YAML file.</w:t>
       </w:r>
     </w:p>
     <w:p>

</xml_diff>

<commit_message>
docs: add mail example to README and office exports
</commit_message>
<xml_diff>
--- a/docs/Cerberus-README-pandoc.docx
+++ b/docs/Cerberus-README-pandoc.docx
@@ -1105,6 +1105,18 @@
         </w:numPr>
       </w:pPr>
       <w:r>
+        <w:t xml:space="preserve">Digest mails keep the differential-alerting model, but now render retained findings by severity block and include advisory summaries when available.</w:t>
+      </w:r>
+    </w:p>
+    <w:p>
+      <w:pPr>
+        <w:pStyle w:val="Compact"/>
+        <w:numPr>
+          <w:numId w:val="1005"/>
+          <w:ilvl w:val="0"/>
+        </w:numPr>
+      </w:pPr>
+      <w:r>
         <w:t xml:space="preserve">Recommendations are stack-aware and depend on ecosystem, package manager context, and whether a fixed version is known.</w:t>
       </w:r>
     </w:p>
@@ -1330,7 +1342,7 @@
         <w:rPr>
           <w:rStyle w:val="VerbatimChar"/>
         </w:rPr>
-        <w:t xml:space="preserve">vhost-cve-monitor --config /etc/vhost-cve-monitor/config.yml test-mail --severity CRITICAL --category vulnerability</w:t>
+        <w:t xml:space="preserve">vhost-cve-monitor-testmail HIGH</w:t>
       </w:r>
     </w:p>
     <w:p>
@@ -1345,7 +1357,7 @@
         <w:rPr>
           <w:rStyle w:val="VerbatimChar"/>
         </w:rPr>
-        <w:t xml:space="preserve">vhost-cve-monitor --config /etc/vhost-cve-monitor/config.yml test-mail --severity WARNING --category scan-failure</w:t>
+        <w:t xml:space="preserve">vhost-cve-monitor --config /etc/vhost-cve-monitor/config.yml test-mail --severity CRITICAL --category vulnerability</w:t>
       </w:r>
     </w:p>
     <w:p>
@@ -1360,7 +1372,7 @@
         <w:rPr>
           <w:rStyle w:val="VerbatimChar"/>
         </w:rPr>
-        <w:t xml:space="preserve">vhost-cve-monitor --config /etc/vhost-cve-monitor/config.yml test-mail --severity HIGH --category internal-error</w:t>
+        <w:t xml:space="preserve">vhost-cve-monitor --config /etc/vhost-cve-monitor/config.yml test-mail --severity WARNING --category scan-failure</w:t>
       </w:r>
     </w:p>
     <w:p>
@@ -1375,7 +1387,7 @@
         <w:rPr>
           <w:rStyle w:val="VerbatimChar"/>
         </w:rPr>
-        <w:t xml:space="preserve">vhost-cve-monitor --config /etc/vhost-cve-monitor/config.yml test-mail --severity MEDIUM --category digest</w:t>
+        <w:t xml:space="preserve">vhost-cve-monitor --config /etc/vhost-cve-monitor/config.yml test-mail --severity HIGH --category internal-error</w:t>
       </w:r>
     </w:p>
     <w:p>
@@ -1390,6 +1402,21 @@
         <w:rPr>
           <w:rStyle w:val="VerbatimChar"/>
         </w:rPr>
+        <w:t xml:space="preserve">vhost-cve-monitor --config /etc/vhost-cve-monitor/config.yml test-mail --severity MEDIUM --category digest</w:t>
+      </w:r>
+    </w:p>
+    <w:p>
+      <w:pPr>
+        <w:pStyle w:val="Compact"/>
+        <w:numPr>
+          <w:numId w:val="1006"/>
+          <w:ilvl w:val="1"/>
+        </w:numPr>
+      </w:pPr>
+      <w:r>
+        <w:rPr>
+          <w:rStyle w:val="VerbatimChar"/>
+        </w:rPr>
         <w:t xml:space="preserve">vhost-cve-monitor --config /etc/vhost-cve-monitor/config.yml test-mail --category vulnerability --stack nodejs --package lodash --installed-version 4.17.23 --fixed-version "&gt;= 4.17.24" --advisory-id GHSA-35jh-r3h4-6jhm</w:t>
       </w:r>
     </w:p>
@@ -1487,11 +1514,84 @@
       <w:pPr>
         <w:pStyle w:val="Heading2"/>
       </w:pPr>
-      <w:bookmarkStart w:id="29" w:name="upgrade-existing-installations"/>
+      <w:bookmarkStart w:id="29" w:name="severity-grouped-html-email-example"/>
+      <w:r>
+        <w:t xml:space="preserve">Severity-grouped HTML email example</w:t>
+      </w:r>
+      <w:bookmarkEnd w:id="29"/>
+    </w:p>
+    <w:p>
+      <w:pPr>
+        <w:pStyle w:val="FirstParagraph"/>
+      </w:pPr>
+      <w:r>
+        <w:t xml:space="preserve">Cerberus sends readable HTML alert emails with per-severity grouping, concise remediation guidance, and a plain-text fallback.</w:t>
+      </w:r>
+    </w:p>
+    <w:p>
+      <w:pPr>
+        <w:pStyle w:val="CaptionedFigure"/>
+      </w:pPr>
+      <w:r>
+        <w:drawing>
+          <wp:inline>
+            <wp:extent cx="5334000" cy="18417116"/>
+            <wp:effectExtent b="0" l="0" r="0" t="0"/>
+            <wp:docPr descr="Cerberus severity-grouped HTML email example" title="" id="1" name="Picture"/>
+            <a:graphic>
+              <a:graphicData uri="http://schemas.openxmlformats.org/drawingml/2006/picture">
+                <pic:pic>
+                  <pic:nvPicPr>
+                    <pic:cNvPr descr="/opt/cerberus/docs/mail-example.png" id="0" name="Picture"/>
+                    <pic:cNvPicPr>
+                      <a:picLocks noChangeArrowheads="1" noChangeAspect="1"/>
+                    </pic:cNvPicPr>
+                  </pic:nvPicPr>
+                  <pic:blipFill>
+                    <a:blip r:embed="rId30"/>
+                    <a:stretch>
+                      <a:fillRect/>
+                    </a:stretch>
+                  </pic:blipFill>
+                  <pic:spPr bwMode="auto">
+                    <a:xfrm>
+                      <a:off x="0" y="0"/>
+                      <a:ext cx="5334000" cy="18417116"/>
+                    </a:xfrm>
+                    <a:prstGeom prst="rect">
+                      <a:avLst/>
+                    </a:prstGeom>
+                    <a:noFill/>
+                    <a:ln w="9525">
+                      <a:noFill/>
+                      <a:headEnd/>
+                      <a:tailEnd/>
+                    </a:ln>
+                  </pic:spPr>
+                </pic:pic>
+              </a:graphicData>
+            </a:graphic>
+          </wp:inline>
+        </w:drawing>
+      </w:r>
+    </w:p>
+    <w:p>
+      <w:pPr>
+        <w:pStyle w:val="ImageCaption"/>
+      </w:pPr>
+      <w:r>
+        <w:t xml:space="preserve">Cerberus severity-grouped HTML email example</w:t>
+      </w:r>
+    </w:p>
+    <w:p>
+      <w:pPr>
+        <w:pStyle w:val="Heading2"/>
+      </w:pPr>
+      <w:bookmarkStart w:id="31" w:name="upgrade-existing-installations"/>
       <w:r>
         <w:t xml:space="preserve">Upgrade Existing Installations</w:t>
       </w:r>
-      <w:bookmarkEnd w:id="29"/>
+      <w:bookmarkEnd w:id="31"/>
     </w:p>
     <w:p>
       <w:pPr>
@@ -1510,16 +1610,31 @@
         </w:numPr>
       </w:pPr>
       <w:r>
-        <w:t xml:space="preserve">update the package from the repository root with</w:t>
-      </w:r>
-      <w:r>
-        <w:t xml:space="preserve"> </w:t>
-      </w:r>
-      <w:r>
-        <w:rPr>
-          <w:rStyle w:val="VerbatimChar"/>
-        </w:rPr>
-        <w:t xml:space="preserve">python3 -m pip install .</w:t>
+        <w:t xml:space="preserve">rerun</w:t>
+      </w:r>
+      <w:r>
+        <w:t xml:space="preserve"> </w:t>
+      </w:r>
+      <w:r>
+        <w:rPr>
+          <w:rStyle w:val="VerbatimChar"/>
+        </w:rPr>
+        <w:t xml:space="preserve">sudo sh packaging/scripts/install.sh</w:t>
+      </w:r>
+      <w:r>
+        <w:t xml:space="preserve"> </w:t>
+      </w:r>
+      <w:r>
+        <w:t xml:space="preserve">from the repository root instead of using global</w:t>
+      </w:r>
+      <w:r>
+        <w:t xml:space="preserve"> </w:t>
+      </w:r>
+      <w:r>
+        <w:rPr>
+          <w:rStyle w:val="VerbatimChar"/>
+        </w:rPr>
+        <w:t xml:space="preserve">pip install</w:t>
       </w:r>
     </w:p>
     <w:p>
@@ -1531,6 +1646,177 @@
         </w:numPr>
       </w:pPr>
       <w:r>
+        <w:t xml:space="preserve">Cerberus is installed into</w:t>
+      </w:r>
+      <w:r>
+        <w:t xml:space="preserve"> </w:t>
+      </w:r>
+      <w:r>
+        <w:rPr>
+          <w:rStyle w:val="VerbatimChar"/>
+        </w:rPr>
+        <w:t xml:space="preserve">/opt/cerberus/.venv</w:t>
+      </w:r>
+    </w:p>
+    <w:p>
+      <w:pPr>
+        <w:pStyle w:val="Compact"/>
+        <w:numPr>
+          <w:numId w:val="1008"/>
+          <w:ilvl w:val="0"/>
+        </w:numPr>
+      </w:pPr>
+      <w:r>
+        <w:t xml:space="preserve">admin-facing wrappers are refreshed in</w:t>
+      </w:r>
+      <w:r>
+        <w:t xml:space="preserve"> </w:t>
+      </w:r>
+      <w:r>
+        <w:rPr>
+          <w:rStyle w:val="VerbatimChar"/>
+        </w:rPr>
+        <w:t xml:space="preserve">/usr/local/bin/</w:t>
+      </w:r>
+    </w:p>
+    <w:p>
+      <w:pPr>
+        <w:pStyle w:val="Compact"/>
+        <w:numPr>
+          <w:numId w:val="1008"/>
+          <w:ilvl w:val="0"/>
+        </w:numPr>
+      </w:pPr>
+      <w:r>
+        <w:t xml:space="preserve">a minimal Debian package is also available through</w:t>
+      </w:r>
+      <w:r>
+        <w:t xml:space="preserve"> </w:t>
+      </w:r>
+      <w:r>
+        <w:rPr>
+          <w:rStyle w:val="VerbatimChar"/>
+        </w:rPr>
+        <w:t xml:space="preserve">dpkg-buildpackage -us -uc</w:t>
+      </w:r>
+      <w:r>
+        <w:t xml:space="preserve">, with the same runtime model under</w:t>
+      </w:r>
+      <w:r>
+        <w:t xml:space="preserve"> </w:t>
+      </w:r>
+      <w:r>
+        <w:rPr>
+          <w:rStyle w:val="VerbatimChar"/>
+        </w:rPr>
+        <w:t xml:space="preserve">/opt/cerberus/.venv</w:t>
+      </w:r>
+    </w:p>
+    <w:p>
+      <w:pPr>
+        <w:pStyle w:val="Compact"/>
+        <w:numPr>
+          <w:numId w:val="1008"/>
+          <w:ilvl w:val="0"/>
+        </w:numPr>
+      </w:pPr>
+      <w:r>
+        <w:t xml:space="preserve">the Debian package relies on</w:t>
+      </w:r>
+      <w:r>
+        <w:t xml:space="preserve"> </w:t>
+      </w:r>
+      <w:r>
+        <w:rPr>
+          <w:rStyle w:val="VerbatimChar"/>
+        </w:rPr>
+        <w:t xml:space="preserve">python3-yaml</w:t>
+      </w:r>
+      <w:r>
+        <w:t xml:space="preserve"> </w:t>
+      </w:r>
+      <w:r>
+        <w:t xml:space="preserve">and a venv created with</w:t>
+      </w:r>
+      <w:r>
+        <w:t xml:space="preserve"> </w:t>
+      </w:r>
+      <w:r>
+        <w:rPr>
+          <w:rStyle w:val="VerbatimChar"/>
+        </w:rPr>
+        <w:t xml:space="preserve">--system-site-packages</w:t>
+      </w:r>
+      <w:r>
+        <w:t xml:space="preserve">, so</w:t>
+      </w:r>
+      <w:r>
+        <w:t xml:space="preserve"> </w:t>
+      </w:r>
+      <w:r>
+        <w:rPr>
+          <w:rStyle w:val="VerbatimChar"/>
+        </w:rPr>
+        <w:t xml:space="preserve">postinst</w:t>
+      </w:r>
+      <w:r>
+        <w:t xml:space="preserve"> </w:t>
+      </w:r>
+      <w:r>
+        <w:t xml:space="preserve">does not need to download Python dependencies</w:t>
+      </w:r>
+    </w:p>
+    <w:p>
+      <w:pPr>
+        <w:pStyle w:val="Compact"/>
+        <w:numPr>
+          <w:numId w:val="1008"/>
+          <w:ilvl w:val="0"/>
+        </w:numPr>
+      </w:pPr>
+      <w:r>
+        <w:t xml:space="preserve">the Debian package ships its example config in</w:t>
+      </w:r>
+      <w:r>
+        <w:t xml:space="preserve"> </w:t>
+      </w:r>
+      <w:r>
+        <w:rPr>
+          <w:rStyle w:val="VerbatimChar"/>
+        </w:rPr>
+        <w:t xml:space="preserve">/usr/share/cerberus/config.yml</w:t>
+      </w:r>
+      <w:r>
+        <w:t xml:space="preserve"> </w:t>
+      </w:r>
+      <w:r>
+        <w:t xml:space="preserve">and only copies it into</w:t>
+      </w:r>
+      <w:r>
+        <w:t xml:space="preserve"> </w:t>
+      </w:r>
+      <w:r>
+        <w:rPr>
+          <w:rStyle w:val="VerbatimChar"/>
+        </w:rPr>
+        <w:t xml:space="preserve">/etc/vhost-cve-monitor/config.yml</w:t>
+      </w:r>
+      <w:r>
+        <w:t xml:space="preserve"> </w:t>
+      </w:r>
+      <w:r>
+        <w:t xml:space="preserve">when no local config exists</w:t>
+      </w:r>
+    </w:p>
+    <w:p>
+      <w:pPr>
+        <w:pStyle w:val="Compact"/>
+        <w:numPr>
+          <w:numId w:val="1008"/>
+          <w:ilvl w:val="0"/>
+        </w:numPr>
+      </w:pPr>
+      <w:r>
         <w:t xml:space="preserve">run</w:t>
       </w:r>
       <w:r>
@@ -1686,13 +1972,42 @@
     </w:p>
     <w:p>
       <w:pPr>
+        <w:pStyle w:val="FirstParagraph"/>
+      </w:pPr>
+      <w:r>
+        <w:t xml:space="preserve">Default deployments keep using local sendmail/Postfix. If you keep the example config unchanged, ensure</w:t>
+      </w:r>
+      <w:r>
+        <w:t xml:space="preserve"> </w:t>
+      </w:r>
+      <w:r>
+        <w:rPr>
+          <w:rStyle w:val="VerbatimChar"/>
+        </w:rPr>
+        <w:t xml:space="preserve">/usr/sbin/sendmail</w:t>
+      </w:r>
+      <w:r>
+        <w:t xml:space="preserve"> </w:t>
+      </w:r>
+      <w:r>
+        <w:t xml:space="preserve">exists on the host.</w:t>
+      </w:r>
+      <w:r>
+        <w:t xml:space="preserve"> </w:t>
+      </w:r>
+      <w:r>
+        <w:t xml:space="preserve">If it does not, Cerberus reports a concise mail-delivery error instead of cascading through an internal Python traceback.</w:t>
+      </w:r>
+    </w:p>
+    <w:p>
+      <w:pPr>
         <w:pStyle w:val="Heading2"/>
       </w:pPr>
-      <w:bookmarkStart w:id="30" w:name="known-limits"/>
+      <w:bookmarkStart w:id="32" w:name="known-limits"/>
       <w:r>
         <w:t xml:space="preserve">Known Limits</w:t>
       </w:r>
-      <w:bookmarkEnd w:id="30"/>
+      <w:bookmarkEnd w:id="32"/>
     </w:p>
     <w:p>
       <w:pPr>
@@ -1758,11 +2073,11 @@
       <w:pPr>
         <w:pStyle w:val="Heading2"/>
       </w:pPr>
-      <w:bookmarkStart w:id="31" w:name="repository-references"/>
+      <w:bookmarkStart w:id="33" w:name="repository-references"/>
       <w:r>
         <w:t xml:space="preserve">Repository References</w:t>
       </w:r>
-      <w:bookmarkEnd w:id="31"/>
+      <w:bookmarkEnd w:id="33"/>
     </w:p>
     <w:p>
       <w:pPr>

</xml_diff>

<commit_message>
cerberus: backfill findings exports and align the documentation
</commit_message>
<xml_diff>
--- a/docs/Cerberus-README-pandoc.docx
+++ b/docs/Cerberus-README-pandoc.docx
@@ -1150,6 +1150,27 @@
         </w:numPr>
       </w:pPr>
       <w:r>
+        <w:rPr>
+          <w:rStyle w:val="VerbatimChar"/>
+        </w:rPr>
+        <w:t xml:space="preserve">export-findings</w:t>
+      </w:r>
+      <w:r>
+        <w:t xml:space="preserve"> </w:t>
+      </w:r>
+      <w:r>
+        <w:t xml:space="preserve">dumps the latest materialized findings snapshot as JSON for external consumers, and initializes that snapshot with a collection-only pass if none exists yet.</w:t>
+      </w:r>
+    </w:p>
+    <w:p>
+      <w:pPr>
+        <w:pStyle w:val="Compact"/>
+        <w:numPr>
+          <w:numId w:val="1005"/>
+          <w:ilvl w:val="0"/>
+        </w:numPr>
+      </w:pPr>
+      <w:r>
         <w:t xml:space="preserve">Supported severities:</w:t>
       </w:r>
       <w:r>
@@ -1424,6 +1445,21 @@
       <w:pPr>
         <w:pStyle w:val="Compact"/>
         <w:numPr>
+          <w:numId w:val="1006"/>
+          <w:ilvl w:val="1"/>
+        </w:numPr>
+      </w:pPr>
+      <w:r>
+        <w:rPr>
+          <w:rStyle w:val="VerbatimChar"/>
+        </w:rPr>
+        <w:t xml:space="preserve">vhost-cve-monitor --config /etc/vhost-cve-monitor/config.yml export-findings</w:t>
+      </w:r>
+    </w:p>
+    <w:p>
+      <w:pPr>
+        <w:pStyle w:val="Compact"/>
+        <w:numPr>
           <w:numId w:val="1005"/>
           <w:ilvl w:val="0"/>
         </w:numPr>
@@ -1468,31 +1504,7 @@
         </w:numPr>
       </w:pPr>
       <w:r>
-        <w:rPr>
-          <w:rStyle w:val="VerbatimChar"/>
-        </w:rPr>
-        <w:t xml:space="preserve">zap.one</w:t>
-      </w:r>
-      <w:r>
-        <w:t xml:space="preserve"> </w:t>
-      </w:r>
-      <w:r>
-        <w:t xml:space="preserve">and</w:t>
-      </w:r>
-      <w:r>
-        <w:t xml:space="preserve"> </w:t>
-      </w:r>
-      <w:r>
-        <w:rPr>
-          <w:rStyle w:val="VerbatimChar"/>
-        </w:rPr>
-        <w:t xml:space="preserve">zapandrok.com</w:t>
-      </w:r>
-      <w:r>
-        <w:t xml:space="preserve"> </w:t>
-      </w:r>
-      <w:r>
-        <w:t xml:space="preserve">both reached a clean</w:t>
+        <w:t xml:space="preserve">delivery reached a clean</w:t>
       </w:r>
       <w:r>
         <w:t xml:space="preserve"> </w:t>
@@ -1968,6 +1980,42 @@
       </w:r>
       <w:r>
         <w:t xml:space="preserve">if mail authentication or local MTA integration changed</w:t>
+      </w:r>
+    </w:p>
+    <w:p>
+      <w:pPr>
+        <w:pStyle w:val="Compact"/>
+        <w:numPr>
+          <w:numId w:val="1008"/>
+          <w:ilvl w:val="0"/>
+        </w:numPr>
+      </w:pPr>
+      <w:r>
+        <w:t xml:space="preserve">the scan timer keeps the materialized findings snapshot current automatically, because each</w:t>
+      </w:r>
+      <w:r>
+        <w:t xml:space="preserve"> </w:t>
+      </w:r>
+      <w:r>
+        <w:rPr>
+          <w:rStyle w:val="VerbatimChar"/>
+        </w:rPr>
+        <w:t xml:space="preserve">scan-once</w:t>
+      </w:r>
+      <w:r>
+        <w:t xml:space="preserve"> </w:t>
+      </w:r>
+      <w:r>
+        <w:t xml:space="preserve">run refreshes the SQLite export state consumed by</w:t>
+      </w:r>
+      <w:r>
+        <w:t xml:space="preserve"> </w:t>
+      </w:r>
+      <w:r>
+        <w:rPr>
+          <w:rStyle w:val="VerbatimChar"/>
+        </w:rPr>
+        <w:t xml:space="preserve">export-findings</w:t>
       </w:r>
     </w:p>
     <w:p>

</xml_diff>